<commit_message>
feat(MoistureDryingRate): AATCC201 多样品合成+历史报告增删; GB21655 每组独占整页 - 新增 combine/aatcc201(同报告号合成, 最多20份, 按时间旧→新拼样品) 与 DELETE reports/{fileName} - 报告列表回填样品名(读 docx Sample 格); ReportFileStore 加 DeleteReport; ReportFileMeta 加 SampleName - Aatcc201 结果表 Average 改纵向合并单格, R3 纳入填充; 新增 Station 支持测试3复用工位 - GB21655 改走 FillReportByPages: 每组≤3工位整页克隆+分页符(WordEditEngine.ClonePageBlock) - 图表统一 12cm 等比缩略; AATCC 图例标"测试N·工位N"; NF5022 TestMethod 默认 2023; 两模板同步改版
</commit_message>
<xml_diff>
--- a/wwwroot/DocxModel/Common_PHY/PHY_AATCC201_DryingRate.docx
+++ b/wwwroot/DocxModel/Common_PHY/PHY_AATCC201_DryingRate.docx
@@ -854,6 +854,7 @@
         <w:tc>
           <w:tcPr>
             <w:tcW w:w="2410" w:type="dxa"/>
+            <w:vMerge w:val="restart"/>
             <w:vAlign w:val="center"/>
           </w:tcPr>
           <w:p>
@@ -953,6 +954,7 @@
         <w:tc>
           <w:tcPr>
             <w:tcW w:w="2410" w:type="dxa"/>
+            <w:vMerge/>
             <w:vAlign w:val="center"/>
           </w:tcPr>
           <w:p>
@@ -1052,6 +1054,7 @@
         <w:tc>
           <w:tcPr>
             <w:tcW w:w="2410" w:type="dxa"/>
+            <w:vMerge/>
             <w:vAlign w:val="center"/>
           </w:tcPr>
           <w:p>
@@ -1318,6 +1321,7 @@
         <w:tc>
           <w:tcPr>
             <w:tcW w:w="2410" w:type="dxa"/>
+            <w:vMerge w:val="restart"/>
             <w:vAlign w:val="center"/>
           </w:tcPr>
           <w:p>
@@ -1417,6 +1421,7 @@
         <w:tc>
           <w:tcPr>
             <w:tcW w:w="2410" w:type="dxa"/>
+            <w:vMerge/>
             <w:vAlign w:val="center"/>
           </w:tcPr>
           <w:p>
@@ -1516,6 +1521,7 @@
         <w:tc>
           <w:tcPr>
             <w:tcW w:w="2410" w:type="dxa"/>
+            <w:vMerge/>
             <w:vAlign w:val="center"/>
           </w:tcPr>
           <w:p>
@@ -1782,6 +1788,7 @@
         <w:tc>
           <w:tcPr>
             <w:tcW w:w="2410" w:type="dxa"/>
+            <w:vMerge w:val="restart"/>
             <w:vAlign w:val="center"/>
           </w:tcPr>
           <w:p>
@@ -1881,6 +1888,7 @@
         <w:tc>
           <w:tcPr>
             <w:tcW w:w="2410" w:type="dxa"/>
+            <w:vMerge/>
             <w:vAlign w:val="center"/>
           </w:tcPr>
           <w:p>
@@ -1980,6 +1988,7 @@
         <w:tc>
           <w:tcPr>
             <w:tcW w:w="2410" w:type="dxa"/>
+            <w:vMerge/>
             <w:vAlign w:val="center"/>
           </w:tcPr>
           <w:p>
@@ -2179,6 +2188,14 @@
           <w:szCs w:val="20"/>
         </w:rPr>
         <w:t>Equipment No: SFL-NGB-EQP-</w:t>
+      </w:r>
+      <w:r>
+        <w:rPr>
+          <w:rFonts w:ascii="Arial" w:eastAsia="黑体" w:hAnsi="Arial" w:cs="Arial" w:hint="eastAsia"/>
+          <w:sz w:val="20"/>
+          <w:szCs w:val="20"/>
+        </w:rPr>
+        <w:t>264</w:t>
       </w:r>
     </w:p>
     <w:p>

</xml_diff>